<commit_message>
Document fresh ASI mock recovery and silent showcase walkthrough
</commit_message>
<xml_diff>
--- a/deliverables/ServiceSetu_Showcase_Handoff.docx
+++ b/deliverables/ServiceSetu_Showcase_Handoff.docx
@@ -25,7 +25,7 @@
     </w:p>
     <w:p>
       <w:r>
-        <w:t>Both MCP connections were checked live, and ASI One rendered TomTom India discoveries and Taskrabbit assistance. The prior mock chat contains the complete 17-event booking and recovery journey. The latest fresh run failed during response delivery and safe hold expiry. A verified public shared chat and the owner recorded video remain required for submission.</w:t>
+        <w:t>A new October 24 ASI One chat rendered live TomTom discoveries and a complete 18-event mock booking, cancellation and replacement journey after safe quote refreshes. A 4 minute 44 second silent edited walkthrough of actual captures is generated. The owner still adds voiceover, uploads it and verifies the public shared-chat link. Earlier transport failures remain historical evidence.</w:t>
       </w:r>
     </w:p>
     <w:p>
@@ -48,7 +48,7 @@
     </w:p>
     <w:p>
       <w:r>
-        <w:t>This package includes the existing Google Places work from Antigravity, reviewed and hardened for publication, plus the owner video script. Google live calls are disabled for the showcase. Private configuration, databases, tokens, seeds and local evidence are excluded.</w:t>
+        <w:t>Commit 1220381 published the preserved Google Places adapter and recording package. The latest handoff adds fresh chat and video evidence. Live Google calls remain disabled. Credentials, databases, seeds, raw captures and the local video are excluded from Git.</w:t>
       </w:r>
     </w:p>
     <w:p>
@@ -4227,12 +4227,12 @@
         <w:pageBreakBefore/>
       </w:pPr>
       <w:r>
-        <w:t>Latest verification and delivery diagnosis</w:t>
+        <w:t>Earlier verification and delivery diagnosis</w:t>
       </w:r>
     </w:p>
     <w:p>
       <w:r>
-        <w:t>Checks span 23 and 24 October. The latest source tests passed on 24 October; the fresh ASI One attempt on 23 October did not complete. Prior completed evidence and the failed attempt must be described separately.</w:t>
+        <w:t>The October 23 attempt below failed; it is separate from the later successful October 24 journey in the final evidence page. Current source tests passed on October 24. Earlier failures remain reliability evidence.</w:t>
       </w:r>
     </w:p>
     <w:tbl>
@@ -4556,7 +4556,7 @@
     </w:p>
     <w:p>
       <w:r>
-        <w:t>The cause is unconfirmed. A renewed attestation succeeded, but the timeout and 401 history cannot be labelled resolved without a successful fresh live workflow. One old process was stopped and one mock mailbox mesh restarted; all 13 clients started, but delivery failures recurred. This is agent messaging transport, not email; adding Gmail or SMTP would not repair it.</w:t>
+        <w:t>The cause is unconfirmed. A renewed attestation and later fresh mock journey succeeded, but neither identifies the root cause or guarantees future uptime. One old process was stopped and one mock mailbox mesh restarted; earlier delivery failures recurred. This is agent transport, not email; Gmail or SMTP would not repair it.</w:t>
       </w:r>
     </w:p>
     <w:p>
@@ -4833,7 +4833,7 @@
                 <w:color w:val="000000"/>
                 <w:sz w:val="18"/>
               </w:rPr>
-              <w:t>Prior full mock journey rendered in one conversation. Latest fresh attempt remains blocked by response delivery and safe expiry. Operator cancellation simulates the provider event; the customer stays in chat.</w:t>
+              <w:t>New October 24 mock journey completed after fresh quotes: original approval/confirmation, provider cancellation/reversal, fresh replacement approval, confirmation and 18 history events. Operator cancellation simulates the provider event; the customer stays in chat.</w:t>
             </w:r>
           </w:p>
         </w:tc>
@@ -5035,7 +5035,7 @@
                 <w:color w:val="000000"/>
                 <w:sz w:val="18"/>
               </w:rPr>
-              <w:t>Video and Devpost</w:t>
+              <w:t>Video and submission</w:t>
             </w:r>
           </w:p>
         </w:tc>
@@ -5061,7 +5061,7 @@
                 <w:color w:val="000000"/>
                 <w:sz w:val="18"/>
               </w:rPr>
-              <w:t>The owner will record and upload the short video. No video or Devpost submission was generated or claimed. Description and recording sequence are prepared below.</w:t>
+              <w:t>A 4:44 silent edited walkthrough of actual new captures is generated. The owner adds voice, uploads it and submits via the mandatory ASI One event dashboard Project Submission Agent. No final submission is claimed.</w:t>
             </w:r>
           </w:p>
         </w:tc>
@@ -5078,7 +5078,7 @@
     </w:p>
     <w:p>
       <w:r>
-        <w:t>Show the household problem and registered Concierge; enter service, location, time and budget; compare provider scope and price; review and explicitly approve; show simulated confirmation; trigger provider cancellation; show the notice, reversal and eligible alternative; freshly approve; finish with replacement confirmation and full history. Keep every customer action in the same ASI One conversation. If showing the prior completed chat, identify it as recorded evidence rather than a new live run.</w:t>
+        <w:t>Add your voice using ServiceSetu_Video_Script.docx. The local silent cut shows actual new ASI One captures from intent and comparison through both approvals, simulated confirmation, cancellation/reversal, replacement and full history. It is edited captured-screen evidence, not continuous real-time footage.</w:t>
       </w:r>
     </w:p>
     <w:p>
@@ -5086,7 +5086,7 @@
         <w:pStyle w:val="Heading2"/>
       </w:pPr>
       <w:r>
-        <w:t>Brief description for Devpost</w:t>
+        <w:t>Brief project description</w:t>
       </w:r>
     </w:p>
     <w:p>
@@ -5104,7 +5104,534 @@
     </w:p>
     <w:p>
       <w:r>
-        <w:t>docs/showcase-readiness.md maps the challenge to evidence, commands and blockers. docs/submission.md records test results and owner responsibilities. docs/acceptance-audit.md points to the current audit, and docs/external-mcp.md records live TomTom evidence. README.md links the audit and video script. Optional Google source and mocked tests are included in the publication package. No private configuration or live Google transaction is included.</w:t>
+        <w:t>README.md links the current audit and video script. docs/showcase-readiness.md and docs/submission.md record evidence and owner actions; docs/external-mcp.md records MCP checks. Google remains mock-tested with live calls disabled; private configuration and raw evidence are excluded.</w:t>
+      </w:r>
+    </w:p>
+    <w:p>
+      <w:pPr>
+        <w:pStyle w:val="Heading1"/>
+        <w:pageBreakBefore/>
+      </w:pPr>
+      <w:r>
+        <w:t>Fresh demonstration and silent video</w:t>
+      </w:r>
+    </w:p>
+    <w:p>
+      <w:r>
+        <w:t>The new authenticated conversation is named Book TomTom Plumbers And AC Service. TomTom returned four Mandi discoveries with attribution and not-onboarded/not-verified labels. The customer then requested AC service in Indiranagar, Bengaluru, for 25 October 2026 at 10 AM IST, maximum INR 1,000. Earlier expired quotes were refreshed without relaxing protections.</w:t>
+      </w:r>
+    </w:p>
+    <w:tbl>
+      <w:tblPr>
+        <w:tblW w:type="auto" w:w="0"/>
+        <w:jc w:val="center"/>
+        <w:tblLayout w:type="fixed"/>
+        <w:tblLook w:firstColumn="1" w:firstRow="1" w:lastColumn="0" w:lastRow="0" w:noHBand="0" w:noVBand="1" w:val="04A0"/>
+        <w:tblBorders>
+          <w:top w:val="single" w:sz="4" w:color="D9D9D9"/>
+          <w:left w:val="single" w:sz="4" w:color="D9D9D9"/>
+          <w:bottom w:val="single" w:sz="4" w:color="D9D9D9"/>
+          <w:right w:val="single" w:sz="4" w:color="D9D9D9"/>
+          <w:insideH w:val="single" w:sz="4" w:color="D9D9D9"/>
+          <w:insideV w:val="single" w:sz="4" w:color="D9D9D9"/>
+        </w:tblBorders>
+      </w:tblPr>
+      <w:tblGrid>
+        <w:gridCol w:w="3600"/>
+        <w:gridCol w:w="6552"/>
+      </w:tblGrid>
+      <w:tr>
+        <w:trPr>
+          <w:tblHeader/>
+        </w:trPr>
+        <w:tc>
+          <w:tcPr>
+            <w:tcW w:type="dxa" w:w="5112"/>
+            <w:vAlign w:val="center"/>
+            <w:shd w:fill="333333"/>
+            <w:tcMar>
+              <w:top w:w="85" w:type="dxa"/>
+              <w:left w:w="85" w:type="dxa"/>
+              <w:bottom w:w="85" w:type="dxa"/>
+              <w:right w:w="85" w:type="dxa"/>
+            </w:tcMar>
+          </w:tcPr>
+          <w:p>
+            <w:pPr>
+              <w:spacing w:after="40" w:line="252" w:lineRule="auto"/>
+            </w:pPr>
+            <w:r>
+              <w:rPr>
+                <w:b/>
+                <w:color w:val="FFFFFF"/>
+                <w:sz w:val="18"/>
+              </w:rPr>
+              <w:t>Observed stage</w:t>
+            </w:r>
+          </w:p>
+        </w:tc>
+        <w:tc>
+          <w:tcPr>
+            <w:tcW w:type="dxa" w:w="5112"/>
+            <w:vAlign w:val="center"/>
+            <w:shd w:fill="333333"/>
+            <w:tcMar>
+              <w:top w:w="85" w:type="dxa"/>
+              <w:left w:w="85" w:type="dxa"/>
+              <w:bottom w:w="85" w:type="dxa"/>
+              <w:right w:w="85" w:type="dxa"/>
+            </w:tcMar>
+          </w:tcPr>
+          <w:p>
+            <w:pPr>
+              <w:spacing w:after="40" w:line="252" w:lineRule="auto"/>
+            </w:pPr>
+            <w:r>
+              <w:rPr>
+                <w:b/>
+                <w:color w:val="FFFFFF"/>
+                <w:sz w:val="18"/>
+              </w:rPr>
+              <w:t>Actual new result</w:t>
+            </w:r>
+          </w:p>
+        </w:tc>
+      </w:tr>
+      <w:tr>
+        <w:trPr>
+          <w:cantSplit/>
+        </w:trPr>
+        <w:tc>
+          <w:tcPr>
+            <w:tcW w:type="dxa" w:w="3600"/>
+            <w:vAlign w:val="center"/>
+            <w:shd w:fill="FFFFFF"/>
+            <w:tcMar>
+              <w:top w:w="85" w:type="dxa"/>
+              <w:left w:w="85" w:type="dxa"/>
+              <w:bottom w:w="85" w:type="dxa"/>
+              <w:right w:w="85" w:type="dxa"/>
+            </w:tcMar>
+          </w:tcPr>
+          <w:p>
+            <w:pPr>
+              <w:spacing w:after="40" w:line="252" w:lineRule="auto"/>
+            </w:pPr>
+            <w:r>
+              <w:rPr>
+                <w:b w:val="0"/>
+                <w:color w:val="000000"/>
+                <w:sz w:val="18"/>
+              </w:rPr>
+              <w:t>Original approval and confirmation</w:t>
+            </w:r>
+          </w:p>
+        </w:tc>
+        <w:tc>
+          <w:tcPr>
+            <w:tcW w:type="dxa" w:w="6552"/>
+            <w:vAlign w:val="center"/>
+            <w:shd w:fill="FFFFFF"/>
+            <w:tcMar>
+              <w:top w:w="85" w:type="dxa"/>
+              <w:left w:w="85" w:type="dxa"/>
+              <w:bottom w:w="85" w:type="dxa"/>
+              <w:right w:w="85" w:type="dxa"/>
+            </w:tcMar>
+          </w:tcPr>
+          <w:p>
+            <w:pPr>
+              <w:spacing w:after="40" w:line="252" w:lineRule="auto"/>
+            </w:pPr>
+            <w:r>
+              <w:rPr>
+                <w:b w:val="0"/>
+                <w:color w:val="000000"/>
+                <w:sz w:val="18"/>
+              </w:rPr>
+              <w:t>CoolCare INR 699; current exact quote approved at 03:10:55 AM IST on October 24. Simulated payment paid and confirmation rendered.</w:t>
+            </w:r>
+          </w:p>
+        </w:tc>
+      </w:tr>
+      <w:tr>
+        <w:trPr>
+          <w:cantSplit/>
+        </w:trPr>
+        <w:tc>
+          <w:tcPr>
+            <w:tcW w:type="dxa" w:w="3600"/>
+            <w:vAlign w:val="center"/>
+            <w:shd w:fill="F4F6F8"/>
+            <w:tcMar>
+              <w:top w:w="85" w:type="dxa"/>
+              <w:left w:w="85" w:type="dxa"/>
+              <w:bottom w:w="85" w:type="dxa"/>
+              <w:right w:w="85" w:type="dxa"/>
+            </w:tcMar>
+          </w:tcPr>
+          <w:p>
+            <w:pPr>
+              <w:spacing w:after="40" w:line="252" w:lineRule="auto"/>
+            </w:pPr>
+            <w:r>
+              <w:rPr>
+                <w:b w:val="0"/>
+                <w:color w:val="000000"/>
+                <w:sz w:val="18"/>
+              </w:rPr>
+              <w:t>Provider cancellation</w:t>
+            </w:r>
+          </w:p>
+        </w:tc>
+        <w:tc>
+          <w:tcPr>
+            <w:tcW w:type="dxa" w:w="6552"/>
+            <w:vAlign w:val="center"/>
+            <w:shd w:fill="F4F6F8"/>
+            <w:tcMar>
+              <w:top w:w="85" w:type="dxa"/>
+              <w:left w:w="85" w:type="dxa"/>
+              <w:bottom w:w="85" w:type="dxa"/>
+              <w:right w:w="85" w:type="dxa"/>
+            </w:tcMar>
+          </w:tcPr>
+          <w:p>
+            <w:pPr>
+              <w:spacing w:after="40" w:line="252" w:lineRule="auto"/>
+            </w:pPr>
+            <w:r>
+              <w:rPr>
+                <w:b w:val="0"/>
+                <w:color w:val="000000"/>
+                <w:sz w:val="18"/>
+              </w:rPr>
+              <w:t>Authenticated existing local operator command cancelled the assigned p1 booking at 03:11:26. Simulated reversal and eligible Breeze offer rendered.</w:t>
+            </w:r>
+          </w:p>
+        </w:tc>
+      </w:tr>
+      <w:tr>
+        <w:trPr>
+          <w:cantSplit/>
+        </w:trPr>
+        <w:tc>
+          <w:tcPr>
+            <w:tcW w:type="dxa" w:w="3600"/>
+            <w:vAlign w:val="center"/>
+            <w:shd w:fill="FFFFFF"/>
+            <w:tcMar>
+              <w:top w:w="85" w:type="dxa"/>
+              <w:left w:w="85" w:type="dxa"/>
+              <w:bottom w:w="85" w:type="dxa"/>
+              <w:right w:w="85" w:type="dxa"/>
+            </w:tcMar>
+          </w:tcPr>
+          <w:p>
+            <w:pPr>
+              <w:spacing w:after="40" w:line="252" w:lineRule="auto"/>
+            </w:pPr>
+            <w:r>
+              <w:rPr>
+                <w:b w:val="0"/>
+                <w:color w:val="000000"/>
+                <w:sz w:val="18"/>
+              </w:rPr>
+              <w:t>Fresh replacement approval</w:t>
+            </w:r>
+          </w:p>
+        </w:tc>
+        <w:tc>
+          <w:tcPr>
+            <w:tcW w:type="dxa" w:w="6552"/>
+            <w:vAlign w:val="center"/>
+            <w:shd w:fill="FFFFFF"/>
+            <w:tcMar>
+              <w:top w:w="85" w:type="dxa"/>
+              <w:left w:w="85" w:type="dxa"/>
+              <w:bottom w:w="85" w:type="dxa"/>
+              <w:right w:w="85" w:type="dxa"/>
+            </w:tcMar>
+          </w:tcPr>
+          <w:p>
+            <w:pPr>
+              <w:spacing w:after="40" w:line="252" w:lineRule="auto"/>
+            </w:pPr>
+            <w:r>
+              <w:rPr>
+                <w:b w:val="0"/>
+                <w:color w:val="000000"/>
+                <w:sz w:val="18"/>
+              </w:rPr>
+              <w:t>Short address rejected and corrected using fictional details. Breeze INR 749 was separately reviewed and approved at 03:14:59; confirmed for the original appointment.</w:t>
+            </w:r>
+          </w:p>
+        </w:tc>
+      </w:tr>
+      <w:tr>
+        <w:trPr>
+          <w:cantSplit/>
+        </w:trPr>
+        <w:tc>
+          <w:tcPr>
+            <w:tcW w:type="dxa" w:w="3600"/>
+            <w:vAlign w:val="center"/>
+            <w:shd w:fill="F4F6F8"/>
+            <w:tcMar>
+              <w:top w:w="85" w:type="dxa"/>
+              <w:left w:w="85" w:type="dxa"/>
+              <w:bottom w:w="85" w:type="dxa"/>
+              <w:right w:w="85" w:type="dxa"/>
+            </w:tcMar>
+          </w:tcPr>
+          <w:p>
+            <w:pPr>
+              <w:spacing w:after="40" w:line="252" w:lineRule="auto"/>
+            </w:pPr>
+            <w:r>
+              <w:rPr>
+                <w:b w:val="0"/>
+                <w:color w:val="000000"/>
+                <w:sz w:val="18"/>
+              </w:rPr>
+              <w:t>Full history</w:t>
+            </w:r>
+          </w:p>
+        </w:tc>
+        <w:tc>
+          <w:tcPr>
+            <w:tcW w:type="dxa" w:w="6552"/>
+            <w:vAlign w:val="center"/>
+            <w:shd w:fill="F4F6F8"/>
+            <w:tcMar>
+              <w:top w:w="85" w:type="dxa"/>
+              <w:left w:w="85" w:type="dxa"/>
+              <w:bottom w:w="85" w:type="dxa"/>
+              <w:right w:w="85" w:type="dxa"/>
+            </w:tcMar>
+          </w:tcPr>
+          <w:p>
+            <w:pPr>
+              <w:spacing w:after="40" w:line="252" w:lineRule="auto"/>
+            </w:pPr>
+            <w:r>
+              <w:rPr>
+                <w:b w:val="0"/>
+                <w:color w:val="000000"/>
+                <w:sz w:val="18"/>
+              </w:rPr>
+              <w:t>All 18 events displayed. Includes original approval/payment/confirmation, cancellation/reversal, recovery, address validation, fresh approval/payment and replacement confirmation.</w:t>
+            </w:r>
+          </w:p>
+        </w:tc>
+      </w:tr>
+      <w:tr>
+        <w:trPr>
+          <w:cantSplit/>
+        </w:trPr>
+        <w:tc>
+          <w:tcPr>
+            <w:tcW w:type="dxa" w:w="3600"/>
+            <w:vAlign w:val="center"/>
+            <w:shd w:fill="FFFFFF"/>
+            <w:tcMar>
+              <w:top w:w="85" w:type="dxa"/>
+              <w:left w:w="85" w:type="dxa"/>
+              <w:bottom w:w="85" w:type="dxa"/>
+              <w:right w:w="85" w:type="dxa"/>
+            </w:tcMar>
+          </w:tcPr>
+          <w:p>
+            <w:pPr>
+              <w:spacing w:after="40" w:line="252" w:lineRule="auto"/>
+            </w:pPr>
+            <w:r>
+              <w:rPr>
+                <w:b w:val="0"/>
+                <w:color w:val="000000"/>
+                <w:sz w:val="18"/>
+              </w:rPr>
+              <w:t>Independent backend check</w:t>
+            </w:r>
+          </w:p>
+        </w:tc>
+        <w:tc>
+          <w:tcPr>
+            <w:tcW w:type="dxa" w:w="6552"/>
+            <w:vAlign w:val="center"/>
+            <w:shd w:fill="FFFFFF"/>
+            <w:tcMar>
+              <w:top w:w="85" w:type="dxa"/>
+              <w:left w:w="85" w:type="dxa"/>
+              <w:bottom w:w="85" w:type="dxa"/>
+              <w:right w:w="85" w:type="dxa"/>
+            </w:tcMar>
+          </w:tcPr>
+          <w:p>
+            <w:pPr>
+              <w:spacing w:after="40" w:line="252" w:lineRule="auto"/>
+            </w:pPr>
+            <w:r>
+              <w:rPr>
+                <w:b w:val="0"/>
+                <w:color w:val="000000"/>
+                <w:sz w:val="18"/>
+              </w:rPr>
+              <w:t>Original: cancelled/refunded. Replacement: confirmed, approved, paid, linked to the original. Both payment records are mock. This is separate from rendered customer evidence.</w:t>
+            </w:r>
+          </w:p>
+        </w:tc>
+      </w:tr>
+      <w:tr>
+        <w:trPr>
+          <w:cantSplit/>
+        </w:trPr>
+        <w:tc>
+          <w:tcPr>
+            <w:tcW w:type="dxa" w:w="3600"/>
+            <w:vAlign w:val="center"/>
+            <w:shd w:fill="F4F6F8"/>
+            <w:tcMar>
+              <w:top w:w="85" w:type="dxa"/>
+              <w:left w:w="85" w:type="dxa"/>
+              <w:bottom w:w="85" w:type="dxa"/>
+              <w:right w:w="85" w:type="dxa"/>
+            </w:tcMar>
+          </w:tcPr>
+          <w:p>
+            <w:pPr>
+              <w:spacing w:after="40" w:line="252" w:lineRule="auto"/>
+            </w:pPr>
+            <w:r>
+              <w:rPr>
+                <w:b w:val="0"/>
+                <w:color w:val="000000"/>
+                <w:sz w:val="18"/>
+              </w:rPr>
+              <w:t>Taskrabbit</w:t>
+            </w:r>
+          </w:p>
+        </w:tc>
+        <w:tc>
+          <w:tcPr>
+            <w:tcW w:type="dxa" w:w="6552"/>
+            <w:vAlign w:val="center"/>
+            <w:shd w:fill="F4F6F8"/>
+            <w:tcMar>
+              <w:top w:w="85" w:type="dxa"/>
+              <w:left w:w="85" w:type="dxa"/>
+              <w:bottom w:w="85" w:type="dxa"/>
+              <w:right w:w="85" w:type="dxa"/>
+            </w:tcMar>
+          </w:tcPr>
+          <w:p>
+            <w:pPr>
+              <w:spacing w:after="40" w:line="252" w:lineRule="auto"/>
+            </w:pPr>
+            <w:r>
+              <w:rPr>
+                <w:b w:val="0"/>
+                <w:color w:val="000000"/>
+                <w:sz w:val="18"/>
+              </w:rPr>
+              <w:t>India refusal rendered; no overseas substitution and no external booking/payment.</w:t>
+            </w:r>
+          </w:p>
+        </w:tc>
+      </w:tr>
+      <w:tr>
+        <w:trPr>
+          <w:cantSplit/>
+        </w:trPr>
+        <w:tc>
+          <w:tcPr>
+            <w:tcW w:type="dxa" w:w="3600"/>
+            <w:vAlign w:val="center"/>
+            <w:shd w:fill="FFFFFF"/>
+            <w:tcMar>
+              <w:top w:w="85" w:type="dxa"/>
+              <w:left w:w="85" w:type="dxa"/>
+              <w:bottom w:w="85" w:type="dxa"/>
+              <w:right w:w="85" w:type="dxa"/>
+            </w:tcMar>
+          </w:tcPr>
+          <w:p>
+            <w:pPr>
+              <w:spacing w:after="40" w:line="252" w:lineRule="auto"/>
+            </w:pPr>
+            <w:r>
+              <w:rPr>
+                <w:b w:val="0"/>
+                <w:color w:val="000000"/>
+                <w:sz w:val="18"/>
+              </w:rPr>
+              <w:t>Silent video</w:t>
+            </w:r>
+          </w:p>
+        </w:tc>
+        <w:tc>
+          <w:tcPr>
+            <w:tcW w:type="dxa" w:w="6552"/>
+            <w:vAlign w:val="center"/>
+            <w:shd w:fill="FFFFFF"/>
+            <w:tcMar>
+              <w:top w:w="85" w:type="dxa"/>
+              <w:left w:w="85" w:type="dxa"/>
+              <w:bottom w:w="85" w:type="dxa"/>
+              <w:right w:w="85" w:type="dxa"/>
+            </w:tcMar>
+          </w:tcPr>
+          <w:p>
+            <w:pPr>
+              <w:spacing w:after="40" w:line="252" w:lineRule="auto"/>
+            </w:pPr>
+            <w:r>
+              <w:rPr>
+                <w:b w:val="0"/>
+                <w:color w:val="000000"/>
+                <w:sz w:val="18"/>
+              </w:rPr>
+              <w:t>ServiceSetu_Silent_Walkthrough.mp4; 284.000 seconds, H.264, 1600 by 900, no audio. Generated from actual captured screens with titles and pauses; not continuous real-time footage. Full decode passed.</w:t>
+            </w:r>
+          </w:p>
+        </w:tc>
+      </w:tr>
+    </w:tbl>
+    <w:p/>
+    <w:p>
+      <w:r>
+        <w:t>Video checksum SHA256: a0a08548a5eaf0090bc7855025c3bf3628e65f1c1c4cfc57dcd51a1fc6a7d782. The local file is excluded from Git. ServiceSetu_Video_Script.docx and docs/video-script.md contain matching timed narration and the new 18-event outline. Raw evidence is not published.</w:t>
+      </w:r>
+    </w:p>
+    <w:p>
+      <w:pPr>
+        <w:pStyle w:val="Heading2"/>
+      </w:pPr>
+      <w:r>
+        <w:t>Official delivery requirements rechecked</w:t>
+      </w:r>
+    </w:p>
+    <w:p>
+      <w:r>
+        <w:t>The official Fetch-A-Thon 3.0 hackpack specifies a 3–5 minute video and mandatory submission through the ASI One event dashboard Project Submission Agent. The owner adds narration, uploads the final video, shares this new conversation and verifies its public URL, then submits the repository, profiles and description. Follow additional organizer instructions, including Devpost if separately requested.</w:t>
+      </w:r>
+    </w:p>
+    <w:p>
+      <w:r>
+        <w:t>Source: https://innovationlab.fetch.ai/events/hackathons/fetch-a-thon-3/hackpack</w:t>
+      </w:r>
+    </w:p>
+    <w:p>
+      <w:pPr>
+        <w:pStyle w:val="Heading2"/>
+      </w:pPr>
+      <w:r>
+        <w:t>Remaining limits</w:t>
+      </w:r>
+    </w:p>
+    <w:p>
+      <w:r>
+        <w:t>One fresh journey passed after safe refreshes; no first-attempt uninterrupted recording, permanent transport fix or continuous uptime is claimed. No remote host was deployed. The owner cannot leave a laptop running for days; free hosting still needs an eligible VM/account and private migration. No real provider agreement, verified live Google call, gateway charge or on-chain transfer is claimed.</w:t>
       </w:r>
     </w:p>
     <w:sectPr>

</xml_diff>

<commit_message>
Refine demo narration and add architecture and FET showcase section
</commit_message>
<xml_diff>
--- a/deliverables/ServiceSetu_Showcase_Handoff.docx
+++ b/deliverables/ServiceSetu_Showcase_Handoff.docx
@@ -25,7 +25,12 @@
     </w:p>
     <w:p>
       <w:r>
-        <w:t>A new October 24 ASI One chat rendered live TomTom discoveries and a complete 18-event mock booking, cancellation and replacement journey after safe quote refreshes. A 4 minute 44 second silent edited walkthrough of actual captures is generated. The owner still adds voiceover, uploads it and verifies the public shared-chat link. Earlier transport failures remain historical evidence.</w:t>
+        <w:t>Team: Ariyan Bhakat and Palak Mittal</w:t>
+      </w:r>
+    </w:p>
+    <w:p>
+      <w:r>
+        <w:t>A new October 24 ASI One chat rendered live TomTom discoveries and a complete 18-event mock booking, cancellation and replacement journey after safe quote refreshes. A 4 minute 54 second silent edited walkthrough of actual captures is generated. The owner still adds voiceover, uploads it and verifies the public shared-chat link. Earlier transport failures remain historical evidence.</w:t>
       </w:r>
     </w:p>
     <w:p>
@@ -5061,7 +5066,7 @@
                 <w:color w:val="000000"/>
                 <w:sz w:val="18"/>
               </w:rPr>
-              <w:t>A 4:44 silent edited walkthrough of actual new captures is generated. The owner adds voice, uploads it and submits via the mandatory ASI One event dashboard Project Submission Agent. No final submission is claimed.</w:t>
+              <w:t>A 4:54 silent edited walkthrough of actual new captures is generated. The owner adds voice, uploads it and submits via the mandatory ASI One event dashboard Project Submission Agent. No final submission is claimed.</w:t>
             </w:r>
           </w:p>
         </w:tc>
@@ -5591,7 +5596,7 @@
                 <w:color w:val="000000"/>
                 <w:sz w:val="18"/>
               </w:rPr>
-              <w:t>ServiceSetu_Silent_Walkthrough.mp4; 284.000 seconds, H.264, 1600 by 900, no audio. Generated from actual captured screens with titles and pauses; not continuous real-time footage. Full decode passed.</w:t>
+              <w:t>ServiceSetu_Demo_v2.mp4; 294.000 seconds, H.264, 1600 by 900, no audio. Version 2 uses actual captures, short captions, an architecture diagram and a dedicated FET source/test section; not continuous real-time footage. Full decode passed.</w:t>
             </w:r>
           </w:p>
         </w:tc>
@@ -5600,7 +5605,7 @@
     <w:p/>
     <w:p>
       <w:r>
-        <w:t>Video checksum SHA256: a0a08548a5eaf0090bc7855025c3bf3628e65f1c1c4cfc57dcd51a1fc6a7d782. The local file is excluded from Git. ServiceSetu_Video_Script.docx and docs/video-script.md contain matching timed narration and the new 18-event outline. Raw evidence is not published.</w:t>
+        <w:t>The local file is excluded from Git. ServiceSetu_Video_Script.docx and docs/video-script.md contain matching timed narration and the new 18-event outline. Raw evidence is not published. docs/architecture.svg and docs/architecture.md describe the current backend; all 18 FET tests were rerun successfully in 1.312 seconds. Live FET checkout remains unverified.</w:t>
       </w:r>
     </w:p>
     <w:p>

</xml_diff>

<commit_message>
Show TomTom public contacts and expand Mandi demo evidence
</commit_message>
<xml_diff>
--- a/deliverables/ServiceSetu_Showcase_Handoff.docx
+++ b/deliverables/ServiceSetu_Showcase_Handoff.docx
@@ -30,7 +30,7 @@
     </w:p>
     <w:p>
       <w:r>
-        <w:t>A new October 24 ASI One chat rendered live TomTom discoveries and a complete 18-event mock booking, cancellation and replacement journey after safe quote refreshes. A 4 minute 54 second silent edited walkthrough of actual captures is generated. The owner still adds voiceover, uploads it and verifies the public shared-chat link. Earlier transport failures remain historical evidence.</w:t>
+        <w:t>A new October 24 ASI One chat rendered live TomTom discoveries and a complete 18-event mock booking, cancellation and replacement journey after safe quote refreshes. A 4 minute 52 second silent edited walkthrough of actual captures is generated. The owner still adds voiceover, uploads it and verifies the public shared-chat link. Earlier transport failures remain historical evidence.</w:t>
       </w:r>
     </w:p>
     <w:p>
@@ -249,7 +249,7 @@
                 <w:color w:val="000000"/>
                 <w:sz w:val="18"/>
               </w:rPr>
-              <w:t>343 tests passed in 34.247 seconds, including 23 Google Places checks. Zero failures and skips. Google checks use mocked responses; no live Google call was made.</w:t>
+              <w:t>346 tests passed in 29.298 seconds, including 23 Google Places checks. Zero failures and skips. Google checks use mocked responses; no live Google call was made.</w:t>
             </w:r>
           </w:p>
         </w:tc>
@@ -306,7 +306,7 @@
                 <w:color w:val="000000"/>
                 <w:sz w:val="18"/>
               </w:rPr>
-              <w:t>22 passed, including an actual SDK connection to an in-process test MCP server, schema validation and booking boundaries.</w:t>
+              <w:t>25 passed, including an actual SDK connection to an in-process test MCP server, schema validation and booking boundaries.</w:t>
             </w:r>
           </w:p>
         </w:tc>
@@ -745,7 +745,7 @@
                 <w:color w:val="000000"/>
                 <w:sz w:val="18"/>
               </w:rPr>
-              <w:t>TomTom geocoding, POI search and routing; Taskrabbit US location checks, availability and explicit draft links.</w:t>
+              <w:t>TomTom geocoding, POI search, public listing phones and routing; Taskrabbit geography, availability and explicit draft links.</w:t>
             </w:r>
           </w:p>
         </w:tc>
@@ -1144,7 +1144,7 @@
                 <w:color w:val="000000"/>
                 <w:sz w:val="18"/>
               </w:rPr>
-              <w:t>22 checks for protocol, result shapes, geography, failure behavior, ownership, retries and no booking creation.</w:t>
+              <w:t>25 checks for protocol, public phones, result shapes, geography, failures, ownership, retries and no booking creation.</w:t>
             </w:r>
           </w:p>
         </w:tc>
@@ -4368,7 +4368,7 @@
                 <w:color w:val="000000"/>
                 <w:sz w:val="18"/>
               </w:rPr>
-              <w:t>343 passed in 34.247 seconds; zero failures and skips. An earlier October 23 sandboxed run had four localhost PermissionError errors and passed its rerun with loopback access.</w:t>
+              <w:t>346 passed in 29.298 seconds; zero failures and skips. An earlier October 23 sandboxed run had four localhost PermissionError errors and passed its rerun with loopback access.</w:t>
             </w:r>
           </w:p>
         </w:tc>
@@ -5066,7 +5066,7 @@
                 <w:color w:val="000000"/>
                 <w:sz w:val="18"/>
               </w:rPr>
-              <w:t>A 4:54 silent edited walkthrough of actual new captures is generated. The owner adds voice, uploads it and submits via the mandatory ASI One event dashboard Project Submission Agent. No final submission is claimed.</w:t>
+              <w:t>A 4:52 silent edited walkthrough of actual new captures is generated. The owner adds voice, uploads it and submits via the mandatory ASI One event dashboard Project Submission Agent. No final submission is claimed.</w:t>
             </w:r>
           </w:p>
         </w:tc>
@@ -5596,7 +5596,7 @@
                 <w:color w:val="000000"/>
                 <w:sz w:val="18"/>
               </w:rPr>
-              <w:t>ServiceSetu_Demo_v2.mp4; 294.000 seconds, H.264, 1600 by 900, no audio. Version 2 uses actual captures, short captions, an architecture diagram and a dedicated FET source/test section; not continuous real-time footage. Full decode passed.</w:t>
+              <w:t>ServiceSetu_Demo_v3.mp4; 292.000 seconds, H.264, 1600 by 900, no audio. Version 3 adds the live backend TomTom call and public contact results, separately labelled from actual ASI captures; it retains the architecture and FET source/test section; not continuous real-time footage. Full decode passed.</w:t>
             </w:r>
           </w:p>
         </w:tc>
@@ -5637,6 +5637,471 @@
     <w:p>
       <w:r>
         <w:t>One fresh journey passed after safe refreshes; no first-attempt uninterrupted recording, permanent transport fix or continuous uptime is claimed. No remote host was deployed. The owner cannot leave a laptop running for days; free hosting still needs an eligible VM/account and private migration. No real provider agreement, verified live Google call, gateway charge or on-chain transfer is claimed.</w:t>
+      </w:r>
+    </w:p>
+    <w:p>
+      <w:pPr>
+        <w:pStyle w:val="Heading1"/>
+        <w:pageBreakBefore/>
+      </w:pPr>
+      <w:r>
+        <w:t>TomTom Mandi public contact evidence</w:t>
+      </w:r>
+    </w:p>
+    <w:p>
+      <w:r>
+        <w:t>The updated 4 minute 52 second video shows the actual TomTom MCP lookup, the earlier ASI One Mandi response and public business phones from the new backend result. Backend data and rendered customer responses are labelled separately. The team credits, architecture diagram and FET implementation section remain. The owner adds narration and uploads the final video.</w:t>
+      </w:r>
+    </w:p>
+    <w:tbl>
+      <w:tblPr>
+        <w:tblW w:type="auto" w:w="0"/>
+        <w:jc w:val="center"/>
+        <w:tblLayout w:type="fixed"/>
+        <w:tblLook w:firstColumn="1" w:firstRow="1" w:lastColumn="0" w:lastRow="0" w:noHBand="0" w:noVBand="1" w:val="04A0"/>
+        <w:tblBorders>
+          <w:top w:val="single" w:sz="4" w:color="D9D9D9"/>
+          <w:left w:val="single" w:sz="4" w:color="D9D9D9"/>
+          <w:bottom w:val="single" w:sz="4" w:color="D9D9D9"/>
+          <w:right w:val="single" w:sz="4" w:color="D9D9D9"/>
+          <w:insideH w:val="single" w:sz="4" w:color="D9D9D9"/>
+          <w:insideV w:val="single" w:sz="4" w:color="D9D9D9"/>
+        </w:tblBorders>
+      </w:tblPr>
+      <w:tblGrid>
+        <w:gridCol w:w="3600"/>
+        <w:gridCol w:w="6552"/>
+      </w:tblGrid>
+      <w:tr>
+        <w:trPr>
+          <w:tblHeader/>
+        </w:trPr>
+        <w:tc>
+          <w:tcPr>
+            <w:tcW w:type="dxa" w:w="5112"/>
+            <w:vAlign w:val="center"/>
+            <w:shd w:fill="333333"/>
+            <w:tcMar>
+              <w:top w:w="85" w:type="dxa"/>
+              <w:left w:w="85" w:type="dxa"/>
+              <w:bottom w:w="85" w:type="dxa"/>
+              <w:right w:w="85" w:type="dxa"/>
+            </w:tcMar>
+          </w:tcPr>
+          <w:p>
+            <w:pPr>
+              <w:spacing w:after="40" w:line="252" w:lineRule="auto"/>
+            </w:pPr>
+            <w:r>
+              <w:rPr>
+                <w:b/>
+                <w:color w:val="FFFFFF"/>
+                <w:sz w:val="18"/>
+              </w:rPr>
+              <w:t>Check</w:t>
+            </w:r>
+          </w:p>
+        </w:tc>
+        <w:tc>
+          <w:tcPr>
+            <w:tcW w:type="dxa" w:w="5112"/>
+            <w:vAlign w:val="center"/>
+            <w:shd w:fill="333333"/>
+            <w:tcMar>
+              <w:top w:w="85" w:type="dxa"/>
+              <w:left w:w="85" w:type="dxa"/>
+              <w:bottom w:w="85" w:type="dxa"/>
+              <w:right w:w="85" w:type="dxa"/>
+            </w:tcMar>
+          </w:tcPr>
+          <w:p>
+            <w:pPr>
+              <w:spacing w:after="40" w:line="252" w:lineRule="auto"/>
+            </w:pPr>
+            <w:r>
+              <w:rPr>
+                <w:b/>
+                <w:color w:val="FFFFFF"/>
+                <w:sz w:val="18"/>
+              </w:rPr>
+              <w:t>Actual result</w:t>
+            </w:r>
+          </w:p>
+        </w:tc>
+      </w:tr>
+      <w:tr>
+        <w:trPr>
+          <w:cantSplit/>
+        </w:trPr>
+        <w:tc>
+          <w:tcPr>
+            <w:tcW w:type="dxa" w:w="3600"/>
+            <w:vAlign w:val="center"/>
+            <w:shd w:fill="FFFFFF"/>
+            <w:tcMar>
+              <w:top w:w="85" w:type="dxa"/>
+              <w:left w:w="85" w:type="dxa"/>
+              <w:bottom w:w="85" w:type="dxa"/>
+              <w:right w:w="85" w:type="dxa"/>
+            </w:tcMar>
+          </w:tcPr>
+          <w:p>
+            <w:pPr>
+              <w:spacing w:after="40" w:line="252" w:lineRule="auto"/>
+            </w:pPr>
+            <w:r>
+              <w:rPr>
+                <w:b w:val="0"/>
+                <w:color w:val="000000"/>
+                <w:sz w:val="18"/>
+              </w:rPr>
+              <w:t>Read only backend lookup</w:t>
+            </w:r>
+          </w:p>
+        </w:tc>
+        <w:tc>
+          <w:tcPr>
+            <w:tcW w:type="dxa" w:w="6552"/>
+            <w:vAlign w:val="center"/>
+            <w:shd w:fill="FFFFFF"/>
+            <w:tcMar>
+              <w:top w:w="85" w:type="dxa"/>
+              <w:left w:w="85" w:type="dxa"/>
+              <w:bottom w:w="85" w:type="dxa"/>
+              <w:right w:w="85" w:type="dxa"/>
+            </w:tcMar>
+          </w:tcPr>
+          <w:p>
+            <w:pPr>
+              <w:spacing w:after="40" w:line="252" w:lineRule="auto"/>
+            </w:pPr>
+            <w:r>
+              <w:rPr>
+                <w:b w:val="0"/>
+                <w:color w:val="000000"/>
+                <w:sz w:val="18"/>
+              </w:rPr>
+              <w:t>October 24: MCP initialization, tool discovery and schema inspection preceded tomtom-fuzzy-search. India POI filter, limit five and full detail returned four Mandi-area listings and four usable public listing phone strings.</w:t>
+            </w:r>
+          </w:p>
+        </w:tc>
+      </w:tr>
+      <w:tr>
+        <w:trPr>
+          <w:cantSplit/>
+        </w:trPr>
+        <w:tc>
+          <w:tcPr>
+            <w:tcW w:type="dxa" w:w="3600"/>
+            <w:vAlign w:val="center"/>
+            <w:shd w:fill="F4F6F8"/>
+            <w:tcMar>
+              <w:top w:w="85" w:type="dxa"/>
+              <w:left w:w="85" w:type="dxa"/>
+              <w:bottom w:w="85" w:type="dxa"/>
+              <w:right w:w="85" w:type="dxa"/>
+            </w:tcMar>
+          </w:tcPr>
+          <w:p>
+            <w:pPr>
+              <w:spacing w:after="40" w:line="252" w:lineRule="auto"/>
+            </w:pPr>
+            <w:r>
+              <w:rPr>
+                <w:b w:val="0"/>
+                <w:color w:val="000000"/>
+                <w:sz w:val="18"/>
+              </w:rPr>
+              <w:t>Public contacts</w:t>
+            </w:r>
+          </w:p>
+        </w:tc>
+        <w:tc>
+          <w:tcPr>
+            <w:tcW w:type="dxa" w:w="6552"/>
+            <w:vAlign w:val="center"/>
+            <w:shd w:fill="F4F6F8"/>
+            <w:tcMar>
+              <w:top w:w="85" w:type="dxa"/>
+              <w:left w:w="85" w:type="dxa"/>
+              <w:bottom w:w="85" w:type="dxa"/>
+              <w:right w:w="85" w:type="dxa"/>
+            </w:tcMar>
+          </w:tcPr>
+          <w:p>
+            <w:pPr>
+              <w:spacing w:after="40" w:line="252" w:lineRule="auto"/>
+            </w:pPr>
+            <w:r>
+              <w:rPr>
+                <w:b w:val="0"/>
+                <w:color w:val="000000"/>
+                <w:sz w:val="18"/>
+              </w:rPr>
+              <w:t>The backend now retains validated public POI phone fields in the discovery card and text fallback. Missing or malformed phones are omitted. Results include Mandi and Jogindar Nagar; customer coverage must be checked.</w:t>
+            </w:r>
+          </w:p>
+        </w:tc>
+      </w:tr>
+      <w:tr>
+        <w:trPr>
+          <w:cantSplit/>
+        </w:trPr>
+        <w:tc>
+          <w:tcPr>
+            <w:tcW w:type="dxa" w:w="3600"/>
+            <w:vAlign w:val="center"/>
+            <w:shd w:fill="FFFFFF"/>
+            <w:tcMar>
+              <w:top w:w="85" w:type="dxa"/>
+              <w:left w:w="85" w:type="dxa"/>
+              <w:bottom w:w="85" w:type="dxa"/>
+              <w:right w:w="85" w:type="dxa"/>
+            </w:tcMar>
+          </w:tcPr>
+          <w:p>
+            <w:pPr>
+              <w:spacing w:after="40" w:line="252" w:lineRule="auto"/>
+            </w:pPr>
+            <w:r>
+              <w:rPr>
+                <w:b w:val="0"/>
+                <w:color w:val="000000"/>
+                <w:sz w:val="18"/>
+              </w:rPr>
+              <w:t>Customer rendering</w:t>
+            </w:r>
+          </w:p>
+        </w:tc>
+        <w:tc>
+          <w:tcPr>
+            <w:tcW w:type="dxa" w:w="6552"/>
+            <w:vAlign w:val="center"/>
+            <w:shd w:fill="FFFFFF"/>
+            <w:tcMar>
+              <w:top w:w="85" w:type="dxa"/>
+              <w:left w:w="85" w:type="dxa"/>
+              <w:bottom w:w="85" w:type="dxa"/>
+              <w:right w:w="85" w:type="dxa"/>
+            </w:tcMar>
+          </w:tcPr>
+          <w:p>
+            <w:pPr>
+              <w:spacing w:after="40" w:line="252" w:lineRule="auto"/>
+            </w:pPr>
+            <w:r>
+              <w:rPr>
+                <w:b w:val="0"/>
+                <w:color w:val="000000"/>
+                <w:sz w:val="18"/>
+              </w:rPr>
+              <w:t>The earlier ASI One Mandi result was captured. The new phone field is verified in the backend and local card tests only. No browser connection was available for a new live ASI One phone-render check.</w:t>
+            </w:r>
+          </w:p>
+        </w:tc>
+      </w:tr>
+      <w:tr>
+        <w:trPr>
+          <w:cantSplit/>
+        </w:trPr>
+        <w:tc>
+          <w:tcPr>
+            <w:tcW w:type="dxa" w:w="3600"/>
+            <w:vAlign w:val="center"/>
+            <w:shd w:fill="F4F6F8"/>
+            <w:tcMar>
+              <w:top w:w="85" w:type="dxa"/>
+              <w:left w:w="85" w:type="dxa"/>
+              <w:bottom w:w="85" w:type="dxa"/>
+              <w:right w:w="85" w:type="dxa"/>
+            </w:tcMar>
+          </w:tcPr>
+          <w:p>
+            <w:pPr>
+              <w:spacing w:after="40" w:line="252" w:lineRule="auto"/>
+            </w:pPr>
+            <w:r>
+              <w:rPr>
+                <w:b w:val="0"/>
+                <w:color w:val="000000"/>
+                <w:sz w:val="18"/>
+              </w:rPr>
+              <w:t>Tests</w:t>
+            </w:r>
+          </w:p>
+        </w:tc>
+        <w:tc>
+          <w:tcPr>
+            <w:tcW w:type="dxa" w:w="6552"/>
+            <w:vAlign w:val="center"/>
+            <w:shd w:fill="F4F6F8"/>
+            <w:tcMar>
+              <w:top w:w="85" w:type="dxa"/>
+              <w:left w:w="85" w:type="dxa"/>
+              <w:bottom w:w="85" w:type="dxa"/>
+              <w:right w:w="85" w:type="dxa"/>
+            </w:tcMar>
+          </w:tcPr>
+          <w:p>
+            <w:pPr>
+              <w:spacing w:after="40" w:line="252" w:lineRule="auto"/>
+            </w:pPr>
+            <w:r>
+              <w:rPr>
+                <w:b w:val="0"/>
+                <w:color w:val="000000"/>
+                <w:sz w:val="18"/>
+              </w:rPr>
+              <w:t>346 core tests passed in 29.298 seconds, zero failures or skips, including 25 MCP tests. Coverage includes safe phone display, malformed/missing values, geocode separation and discovery leaving booking/payment tables empty.</w:t>
+            </w:r>
+          </w:p>
+        </w:tc>
+      </w:tr>
+      <w:tr>
+        <w:trPr>
+          <w:cantSplit/>
+        </w:trPr>
+        <w:tc>
+          <w:tcPr>
+            <w:tcW w:type="dxa" w:w="3600"/>
+            <w:vAlign w:val="center"/>
+            <w:shd w:fill="FFFFFF"/>
+            <w:tcMar>
+              <w:top w:w="85" w:type="dxa"/>
+              <w:left w:w="85" w:type="dxa"/>
+              <w:bottom w:w="85" w:type="dxa"/>
+              <w:right w:w="85" w:type="dxa"/>
+            </w:tcMar>
+          </w:tcPr>
+          <w:p>
+            <w:pPr>
+              <w:spacing w:after="40" w:line="252" w:lineRule="auto"/>
+            </w:pPr>
+            <w:r>
+              <w:rPr>
+                <w:b w:val="0"/>
+                <w:color w:val="000000"/>
+                <w:sz w:val="18"/>
+              </w:rPr>
+              <w:t>Contact boundary</w:t>
+            </w:r>
+          </w:p>
+        </w:tc>
+        <w:tc>
+          <w:tcPr>
+            <w:tcW w:type="dxa" w:w="6552"/>
+            <w:vAlign w:val="center"/>
+            <w:shd w:fill="FFFFFF"/>
+            <w:tcMar>
+              <w:top w:w="85" w:type="dxa"/>
+              <w:left w:w="85" w:type="dxa"/>
+              <w:bottom w:w="85" w:type="dxa"/>
+              <w:right w:w="85" w:type="dxa"/>
+            </w:tcMar>
+          </w:tcPr>
+          <w:p>
+            <w:pPr>
+              <w:spacing w:after="40" w:line="252" w:lineRule="auto"/>
+            </w:pPr>
+            <w:r>
+              <w:rPr>
+                <w:b w:val="0"/>
+                <w:color w:val="000000"/>
+                <w:sz w:val="18"/>
+              </w:rPr>
+              <w:t>Customers may manually call a public listing number. No business was called, imported, verified, reserved or charged. ServiceSetu does not offer automatic telephone calling.</w:t>
+            </w:r>
+          </w:p>
+        </w:tc>
+      </w:tr>
+      <w:tr>
+        <w:trPr>
+          <w:cantSplit/>
+        </w:trPr>
+        <w:tc>
+          <w:tcPr>
+            <w:tcW w:type="dxa" w:w="3600"/>
+            <w:vAlign w:val="center"/>
+            <w:shd w:fill="F4F6F8"/>
+            <w:tcMar>
+              <w:top w:w="85" w:type="dxa"/>
+              <w:left w:w="85" w:type="dxa"/>
+              <w:bottom w:w="85" w:type="dxa"/>
+              <w:right w:w="85" w:type="dxa"/>
+            </w:tcMar>
+          </w:tcPr>
+          <w:p>
+            <w:pPr>
+              <w:spacing w:after="40" w:line="252" w:lineRule="auto"/>
+            </w:pPr>
+            <w:r>
+              <w:rPr>
+                <w:b w:val="0"/>
+                <w:color w:val="000000"/>
+                <w:sz w:val="18"/>
+              </w:rPr>
+              <w:t>Pilot responsibility</w:t>
+            </w:r>
+          </w:p>
+        </w:tc>
+        <w:tc>
+          <w:tcPr>
+            <w:tcW w:type="dxa" w:w="6552"/>
+            <w:vAlign w:val="center"/>
+            <w:shd w:fill="F4F6F8"/>
+            <w:tcMar>
+              <w:top w:w="85" w:type="dxa"/>
+              <w:left w:w="85" w:type="dxa"/>
+              <w:bottom w:w="85" w:type="dxa"/>
+              <w:right w:w="85" w:type="dxa"/>
+            </w:tcMar>
+          </w:tcPr>
+          <w:p>
+            <w:pPr>
+              <w:spacing w:after="40" w:line="252" w:lineRule="auto"/>
+            </w:pPr>
+            <w:r>
+              <w:rPr>
+                <w:b w:val="0"/>
+                <w:color w:val="000000"/>
+                <w:sz w:val="18"/>
+              </w:rPr>
+              <w:t>Confirm the service area, appointment, exact work and price directly with the business. Obtain provider agreement before operator onboarding. A phone listing is not a confirmed ServiceSetu booking.</w:t>
+            </w:r>
+          </w:p>
+        </w:tc>
+      </w:tr>
+    </w:tbl>
+    <w:p/>
+    <w:p>
+      <w:pPr>
+        <w:pStyle w:val="Heading2"/>
+      </w:pPr>
+      <w:r>
+        <w:t>Next live check</w:t>
+      </w:r>
+    </w:p>
+    <w:p>
+      <w:r>
+        <w:t>Restart the existing single mock runtime once to load the source change, keeping its private configuration and database. In the authenticated ASI One conversation send the prompt below, then verify the public listing phones, attribution and discovery labels. Do not start a duplicate mailbox mesh.</w:t>
+      </w:r>
+    </w:p>
+    <w:p>
+      <w:pPr>
+        <w:keepNext w:val="0"/>
+        <w:spacing w:after="140" w:line="240" w:lineRule="auto"/>
+      </w:pPr>
+      <w:r>
+        <w:rPr>
+          <w:rFonts w:ascii="Courier New" w:hAnsi="Courier New"/>
+          <w:sz w:val="16"/>
+        </w:rPr>
+        <w:t>@servicesetu TomTom plumbers in Mandi, Himachal Pradesh, India</w:t>
+      </w:r>
+    </w:p>
+    <w:p>
+      <w:r>
+        <w:t>Raw MCP results, public contact evidence and video remain local and ignored by Git. The public repository contains the adapter/card changes, tests and documentation. No credentials, customer data or private chat links are included.</w:t>
       </w:r>
     </w:p>
     <w:sectPr>

</xml_diff>